<commit_message>
- Added .env and .env.example for environment-based DB config - Created EnvLoader.php - Updated database.php to use EnvLoader - Created AbstractSuratController - Refactored SuratTugasController - Refactored SuratUndanganController
</commit_message>
<xml_diff>
--- a/backend/templates/template_surat_undangan_offline.docx
+++ b/backend/templates/template_surat_undangan_offline.docx
@@ -370,7 +370,13 @@
         <w:t xml:space="preserve">                          </w:t>
       </w:r>
       <w:r>
-        <w:t>Lampiran : satu lembar</w:t>
+        <w:t xml:space="preserve">Lampiran : </w:t>
+      </w:r>
+      <w:r>
+        <w:t>${JUMLAH_LAMPIRAN}</w:t>
+      </w:r>
+      <w:r>
+        <w:t xml:space="preserve"> lembar</w:t>
       </w:r>
     </w:p>
     <w:p>

</xml_diff>

<commit_message>
Fix: Perbaikan format waktu, keamanan kode, dan cleanup file
- Ubah format waktu dari '10.49 - 12.30 WIB' menjadi '10.49 s.d. 12.30 WIB'
- Perbaiki keamanan SQL injection di PegawaiService dengan whitelist orderBy
- Tambahkan validasi input yang lebih ketat untuk semua service
- Fix error di SuratService dan PegawaiService (missing imports)
- Hapus file dokumentasi dan temporary yang tidak diperlukan
- Konsistensi format waktu antara backend dan frontend preview
</commit_message>
<xml_diff>
--- a/backend/templates/template_surat_undangan_offline.docx
+++ b/backend/templates/template_surat_undangan_offline.docx
@@ -514,7 +514,7 @@
         <w:rPr>
           <w:spacing w:val="-8"/>
         </w:rPr>
-        <w:t xml:space="preserve">  </w:t>
+        <w:t xml:space="preserve"> </w:t>
       </w:r>
       <w:r>
         <w:rPr>
@@ -546,15 +546,13 @@
       </w:r>
       <w:r>
         <w:tab/>
-        <w:t xml:space="preserve">: ${WAKTU_AWAL} </w:t>
-      </w:r>
-      <w:proofErr w:type="spellStart"/>
-      <w:r>
-        <w:t>s.d</w:t>
-      </w:r>
-      <w:proofErr w:type="spellEnd"/>
-      <w:r>
-        <w:t>. ${WKTU_AKHIR}</w:t>
+        <w:t>: ${WAKTU_AWAL}</w:t>
+      </w:r>
+      <w:r>
+        <w:t xml:space="preserve"> </w:t>
+      </w:r>
+      <w:r>
+        <w:t>${WKTU_AKHIR}</w:t>
       </w:r>
     </w:p>
     <w:p>
@@ -2016,10 +2014,6 @@
 </file>
 
 <file path=customXml/item1.xml><?xml version="1.0" encoding="utf-8"?>
-<b:Sources xmlns="http://schemas.openxmlformats.org/officeDocument/2006/bibliography" xmlns:b="http://schemas.openxmlformats.org/officeDocument/2006/bibliography" Version="6" StyleName="APA" SelectedStyle="\APASixthEditionOfficeOnline.xsl"/>
-</file>
-
-<file path=customXml/item2.xml><?xml version="1.0" encoding="utf-8"?>
 <s:customData xmlns="http://www.wps.cn/officeDocument/2013/wpsCustomData" xmlns:s="http://www.wps.cn/officeDocument/2013/wpsCustomData">
   <customSectProps>
     <customSectPr/>
@@ -2030,18 +2024,22 @@
 </s:customData>
 </file>
 
+<file path=customXml/item2.xml><?xml version="1.0" encoding="utf-8"?>
+<b:Sources xmlns="http://schemas.openxmlformats.org/officeDocument/2006/bibliography" xmlns:b="http://schemas.openxmlformats.org/officeDocument/2006/bibliography" Version="6" StyleName="APA" SelectedStyle="\APASixthEditionOfficeOnline.xsl"/>
+</file>
+
 <file path=customXml/itemProps1.xml><?xml version="1.0" encoding="utf-8"?>
+<ds:datastoreItem xmlns:ds="http://schemas.openxmlformats.org/officeDocument/2006/customXml" ds:itemID="{B1977F7D-205B-4081-913C-38D41E755F92}">
+  <ds:schemaRefs>
+    <ds:schemaRef ds:uri="http://www.wps.cn/officeDocument/2013/wpsCustomData"/>
+  </ds:schemaRefs>
+</ds:datastoreItem>
+</file>
+
+<file path=customXml/itemProps2.xml><?xml version="1.0" encoding="utf-8"?>
 <ds:datastoreItem xmlns:ds="http://schemas.openxmlformats.org/officeDocument/2006/customXml" ds:itemID="{30594D93-E6BC-4907-A61B-44FE3F6F4511}">
   <ds:schemaRefs>
     <ds:schemaRef ds:uri="http://schemas.openxmlformats.org/officeDocument/2006/bibliography"/>
   </ds:schemaRefs>
 </ds:datastoreItem>
-</file>
-
-<file path=customXml/itemProps2.xml><?xml version="1.0" encoding="utf-8"?>
-<ds:datastoreItem xmlns:ds="http://schemas.openxmlformats.org/officeDocument/2006/customXml" ds:itemID="{B1977F7D-205B-4081-913C-38D41E755F92}">
-  <ds:schemaRefs>
-    <ds:schemaRef ds:uri="http://www.wps.cn/officeDocument/2013/wpsCustomData"/>
-  </ds:schemaRefs>
-</ds:datastoreItem>
 </file>
</xml_diff>